<commit_message>
Refine CV & profile: drop CAC 40, add textile passion, name External Activities / Hermès Textile Division, hyperlink LinkedIn
Co-Authored-By: Claude Opus 4.8 <noreply@anthropic.com>
Claude-Session: https://claude.ai/code/session_01AheqiPu51AkPwVXxsTYaLv
</commit_message>
<xml_diff>
--- a/CV_Nicolas_Denna_2026_Master.docx
+++ b/CV_Nicolas_Denna_2026_Master.docx
@@ -40,8 +40,17 @@
           <w:color w:val="555555"/>
           <w:sz w:val="18"/>
         </w:rPr>
-        <w:t>Tel Aviv, Israel  ·  EU + Israeli citizen  ·  nicolas_denna@hotmail.com  ·  +33 6 42 93 52 54  ·  LinkedIn</w:t>
+        <w:t xml:space="preserve">Tel Aviv, Israel  ·  EU + Israeli citizen  ·  nicolas_denna@hotmail.com  ·  +33 6 42 93 52 54  ·  </w:t>
       </w:r>
+      <w:hyperlink r:id="rId9">
+        <w:r>
+          <w:rPr>
+            <w:color w:val="1F3A5F"/>
+            <w:sz w:val="18"/>
+          </w:rPr>
+          <w:t>LinkedIn</w:t>
+        </w:r>
+      </w:hyperlink>
     </w:p>
     <w:p>
       <w:pPr>
@@ -81,20 +90,33 @@
         <w:rPr>
           <w:sz w:val="20"/>
         </w:rPr>
-        <w:t xml:space="preserve">Commercial leader with 15+ years driving growth across luxury fashion and high-end textile in Europe and Asia — including six years as Commercial Director at </w:t>
+        <w:t xml:space="preserve">Commercial leader with 15+ years driving growth across luxury fashion and high-end textile in Europe and Asia — including six years as Commercial Director of </w:t>
       </w:r>
       <w:r>
         <w:rPr>
           <w:b/>
           <w:sz w:val="20"/>
         </w:rPr>
-        <w:t>Hermès</w:t>
+        <w:t>External Activities</w:t>
       </w:r>
       <w:r>
         <w:rPr>
           <w:sz w:val="20"/>
         </w:rPr>
-        <w:t xml:space="preserve">, on the Business Unit Executive Committee within a CAC 40 group. Proven builder of commercial functions, elite sales teams and premium client portfolios; equally strong on P&amp;L rigor, margin and the creative-commercial bridge. Now completing a Global MBA in AI &amp; Entrepreneurship (Tel Aviv University), bringing a rare fusion of luxury operational excellence and next-generation technology. Philosophy: </w:t>
+        <w:t xml:space="preserve"> at </w:t>
+      </w:r>
+      <w:r>
+        <w:rPr>
+          <w:b/>
+          <w:sz w:val="20"/>
+        </w:rPr>
+        <w:t>Hermès Textile Division</w:t>
+      </w:r>
+      <w:r>
+        <w:rPr>
+          <w:sz w:val="20"/>
+        </w:rPr>
+        <w:t xml:space="preserve">, on the Business Unit Executive Committee. Proven builder of commercial functions, elite sales teams and premium client portfolios; equally strong on P&amp;L rigor, margin and the creative-commercial bridge. Now completing a Global MBA in AI &amp; Entrepreneurship (Tel Aviv University), bringing a rare fusion of luxury operational excellence and next-generation technology. Above all, a lifelong passion for textile — its craft, its materials and its makers — drives everything I do. Philosophy: </w:t>
       </w:r>
       <w:r>
         <w:rPr>
@@ -158,7 +180,7 @@
         <w:rPr>
           <w:sz w:val="20"/>
         </w:rPr>
-        <w:t>Multi-Site Industrial Forecasting · Supply Chain &amp; Output Planning · CAC 40 Financial Reporting · Product-to-Market Speed</w:t>
+        <w:t>Multi-Site Industrial Forecasting · Supply Chain &amp; Output Planning · Financial Reporting &amp; Controls · Product-to-Market Speed</w:t>
       </w:r>
     </w:p>
     <w:p>
@@ -323,7 +345,7 @@
           <w:color w:val="555555"/>
           <w:sz w:val="19"/>
         </w:rPr>
-        <w:t>Owned the P&amp;L for External Activities — external commercialization of the output of 8 Hermès-owned textile factories (finished accessories, fabric, semi-finished), a high-margin business, as a member of the Business Unit Executive Committee within a CAC 40 group.</w:t>
+        <w:t>Owned the P&amp;L for External Activities — external commercialization of the output of 8 Hermès-owned textile factories (finished accessories, fabric, semi-finished), a high-margin business, as a member of the Business Unit Executive Committee.</w:t>
       </w:r>
     </w:p>
     <w:p>
@@ -414,7 +436,7 @@
         <w:rPr>
           <w:sz w:val="20"/>
         </w:rPr>
-        <w:t>Cut cost base (tradeshows, sampling) while protecting margin; delivered CAC 40-grade financial reporting and industrial forecasting across 8 sites.</w:t>
+        <w:t>Cut cost base (tradeshows, sampling) while protecting margin; delivered rigorous financial reporting and industrial forecasting across all 8 sites.</w:t>
       </w:r>
     </w:p>
     <w:p>

</xml_diff>

<commit_message>
Upgrade CV to 10/10: add Career Highlights band, surface leadership, evidence luxury x AI via Brand Selection (phygital, digital twin, 27 brands, 3.4x AOV)
Co-Authored-By: Claude Opus 4.8 <noreply@anthropic.com>
Claude-Session: https://claude.ai/code/session_01AheqiPu51AkPwVXxsTYaLv
</commit_message>
<xml_diff>
--- a/CV_Nicolas_Denna_2026_Master.docx
+++ b/CV_Nicolas_Denna_2026_Master.docx
@@ -40,7 +40,7 @@
           <w:color w:val="555555"/>
           <w:sz w:val="18"/>
         </w:rPr>
-        <w:t xml:space="preserve">Tel Aviv, Israel  ·  EU + Israeli citizen  ·  nicolas_denna@hotmail.com  ·  +33 6 42 93 52 54  ·  </w:t>
+        <w:t xml:space="preserve">Tel Aviv, Israel  ·  EU citizen  ·  nicolas_denna@hotmail.com  ·  +33 6 42 93 52 54  ·  </w:t>
       </w:r>
       <w:hyperlink r:id="rId9">
         <w:r>
@@ -62,7 +62,7 @@
           <w:color w:val="555555"/>
           <w:sz w:val="18"/>
         </w:rPr>
-        <w:t>Native Italian &amp; French  ·  Fluent English  ·  Intermediate German</w:t>
+        <w:t>Native Italian &amp; French  ·  Fluent English  ·  Intermediate German  ·  Basic Japanese</w:t>
       </w:r>
     </w:p>
     <w:p>
@@ -116,7 +116,7 @@
         <w:rPr>
           <w:sz w:val="20"/>
         </w:rPr>
-        <w:t xml:space="preserve">, on the Business Unit Executive Committee. Proven builder of commercial functions, elite sales teams and premium client portfolios; equally strong on P&amp;L rigor, margin and the creative-commercial bridge. Now completing a Global MBA in AI &amp; Entrepreneurship (Tel Aviv University), bringing a rare fusion of luxury operational excellence and next-generation technology. Above all, a lifelong passion for textile — its craft, its materials and its makers — drives everything I do. Philosophy: </w:t>
+        <w:t xml:space="preserve">, on the Business Unit Executive Committee. Proven builder of commercial functions, elite sales teams and premium client portfolios; equally strong on P&amp;L rigor, margin and the creative-commercial bridge. Now completing a Global MBA in AI &amp; Entrepreneurship (Tel Aviv University), bringing a rare fusion of luxury operational excellence and next-generation technology. Above all, a lifelong passion for textile — its complexity, its materials and its makers — drives everything I do. Philosophy: </w:t>
       </w:r>
       <w:r>
         <w:rPr>
@@ -126,6 +126,144 @@
           <w:sz w:val="20"/>
         </w:rPr>
         <w:t>keep the know-how, make it shine.</w:t>
+      </w:r>
+    </w:p>
+    <w:p>
+      <w:pPr>
+        <w:spacing w:before="160" w:after="60" w:line="240" w:lineRule="auto"/>
+        <w:pBdr>
+          <w:bottom w:val="single" w:sz="6" w:space="2" w:color="1F3A5F"/>
+        </w:pBdr>
+      </w:pPr>
+      <w:r>
+        <w:rPr>
+          <w:b/>
+          <w:color w:val="1F3A5F"/>
+          <w:sz w:val="22"/>
+          <w:spacing w:val="20"/>
+        </w:rPr>
+        <w:t>CAREER HIGHLIGHTS</w:t>
+      </w:r>
+    </w:p>
+    <w:p>
+      <w:pPr>
+        <w:spacing w:before="20" w:after="20" w:line="252" w:lineRule="auto"/>
+        <w:ind w:left="288" w:hanging="288"/>
+      </w:pPr>
+      <w:r>
+        <w:rPr>
+          <w:color w:val="1F3A5F"/>
+          <w:sz w:val="20"/>
+        </w:rPr>
+        <w:t xml:space="preserve">▪  </w:t>
+      </w:r>
+      <w:r>
+        <w:rPr>
+          <w:b/>
+          <w:color w:val="1F3A5F"/>
+          <w:sz w:val="20"/>
+        </w:rPr>
+        <w:t xml:space="preserve">Hermès pedigree — </w:t>
+      </w:r>
+      <w:r>
+        <w:rPr>
+          <w:sz w:val="20"/>
+        </w:rPr>
+        <w:t>six years as Commercial Director, External Activities, on the Business Unit Executive Committee of Hermès Textile Division.</w:t>
+      </w:r>
+    </w:p>
+    <w:p>
+      <w:pPr>
+        <w:spacing w:before="20" w:after="20" w:line="252" w:lineRule="auto"/>
+        <w:ind w:left="288" w:hanging="288"/>
+      </w:pPr>
+      <w:r>
+        <w:rPr>
+          <w:color w:val="1F3A5F"/>
+          <w:sz w:val="20"/>
+        </w:rPr>
+        <w:t xml:space="preserve">▪  </w:t>
+      </w:r>
+      <w:r>
+        <w:rPr>
+          <w:b/>
+          <w:color w:val="1F3A5F"/>
+          <w:sz w:val="20"/>
+        </w:rPr>
+        <w:t xml:space="preserve">Proven builder — </w:t>
+      </w:r>
+      <w:r>
+        <w:rPr>
+          <w:sz w:val="20"/>
+        </w:rPr>
+        <w:t>launched a business line from €100K to €2M (20×) and re-engineered a client portfolio from ~300 to 20 accounts to raise service and margin.</w:t>
+      </w:r>
+    </w:p>
+    <w:p>
+      <w:pPr>
+        <w:spacing w:before="20" w:after="20" w:line="252" w:lineRule="auto"/>
+        <w:ind w:left="288" w:hanging="288"/>
+      </w:pPr>
+      <w:r>
+        <w:rPr>
+          <w:color w:val="1F3A5F"/>
+          <w:sz w:val="20"/>
+        </w:rPr>
+        <w:t xml:space="preserve">▪  </w:t>
+      </w:r>
+      <w:r>
+        <w:rPr>
+          <w:b/>
+          <w:color w:val="1F3A5F"/>
+          <w:sz w:val="20"/>
+        </w:rPr>
+        <w:t xml:space="preserve">Scale &amp; growth — </w:t>
+      </w:r>
+      <w:r>
+        <w:rPr>
+          <w:sz w:val="20"/>
+        </w:rPr>
+        <w:t>ran a ~€30M commercial P&amp;L across four Asian offices; grew turnover +40% at Bonotto.</w:t>
+      </w:r>
+    </w:p>
+    <w:p>
+      <w:pPr>
+        <w:spacing w:before="20" w:after="20" w:line="252" w:lineRule="auto"/>
+        <w:ind w:left="288" w:hanging="288"/>
+      </w:pPr>
+      <w:r>
+        <w:rPr>
+          <w:color w:val="1F3A5F"/>
+          <w:sz w:val="20"/>
+        </w:rPr>
+        <w:t xml:space="preserve">▪  </w:t>
+      </w:r>
+      <w:r>
+        <w:rPr>
+          <w:b/>
+          <w:color w:val="1F3A5F"/>
+          <w:sz w:val="20"/>
+        </w:rPr>
+        <w:t xml:space="preserve">Luxury × technology — </w:t>
+      </w:r>
+      <w:r>
+        <w:rPr>
+          <w:sz w:val="20"/>
+        </w:rPr>
+        <w:t>founded a phygital B2B platform with a 3D digital-twin showroom — 27 Italian brands, ~50 agents, lifting average order value €250 → €850 (3.4×).</w:t>
+      </w:r>
+    </w:p>
+    <w:p>
+      <w:pPr>
+        <w:spacing w:before="40" w:after="0" w:line="240" w:lineRule="auto"/>
+      </w:pPr>
+      <w:r>
+        <w:rPr>
+          <w:i/>
+          <w:color w:val="555555"/>
+          <w:sz w:val="19"/>
+        </w:rPr>
+        <w:t>Leadership: a visionary, high-standards leader and a natural bridge between creative and commercial — known for energizing teams with fresh, out-of-the-box thinking.</w:t>
       </w:r>
     </w:p>
     <w:p>
@@ -282,6 +420,19 @@
     </w:p>
     <w:p>
       <w:pPr>
+        <w:spacing w:before="0" w:after="40" w:line="240" w:lineRule="auto"/>
+      </w:pPr>
+      <w:r>
+        <w:rPr>
+          <w:i/>
+          <w:color w:val="555555"/>
+          <w:sz w:val="19"/>
+        </w:rPr>
+        <w:t>Early-stage B2B platform helping Made-in-Italy fashion SMEs scale internationally in the phygital era.</w:t>
+      </w:r>
+    </w:p>
+    <w:p>
+      <w:pPr>
         <w:pStyle w:val="ListBullet"/>
         <w:spacing w:before="0" w:after="20" w:line="245" w:lineRule="auto"/>
         <w:ind w:left="317" w:hanging="216"/>
@@ -290,7 +441,98 @@
         <w:rPr>
           <w:sz w:val="20"/>
         </w:rPr>
-        <w:t>Building international B2B distribution models for Italian luxury fashion SMEs entering global markets.</w:t>
+        <w:t xml:space="preserve">Signed </w:t>
+      </w:r>
+      <w:r>
+        <w:rPr>
+          <w:b/>
+          <w:sz w:val="20"/>
+        </w:rPr>
+        <w:t>27 Italian SME brands</w:t>
+      </w:r>
+      <w:r>
+        <w:rPr>
+          <w:sz w:val="20"/>
+        </w:rPr>
+        <w:t xml:space="preserve"> and built a network of ~50 agents across Italy, the EU and beyond onto a B2B marketplace.</w:t>
+      </w:r>
+    </w:p>
+    <w:p>
+      <w:pPr>
+        <w:pStyle w:val="ListBullet"/>
+        <w:spacing w:before="0" w:after="20" w:line="245" w:lineRule="auto"/>
+        <w:ind w:left="317" w:hanging="216"/>
+      </w:pPr>
+      <w:r>
+        <w:rPr>
+          <w:sz w:val="20"/>
+        </w:rPr>
+        <w:t xml:space="preserve">Designed and built a </w:t>
+      </w:r>
+      <w:r>
+        <w:rPr>
+          <w:b/>
+          <w:sz w:val="20"/>
+        </w:rPr>
+        <w:t>phygital sales process</w:t>
+      </w:r>
+      <w:r>
+        <w:rPr>
+          <w:sz w:val="20"/>
+        </w:rPr>
+        <w:t>, including a digital-twin 3D gallery enabling a hybrid physical-plus-digital purchase journey.</w:t>
+      </w:r>
+    </w:p>
+    <w:p>
+      <w:pPr>
+        <w:pStyle w:val="ListBullet"/>
+        <w:spacing w:before="0" w:after="20" w:line="245" w:lineRule="auto"/>
+        <w:ind w:left="317" w:hanging="216"/>
+      </w:pPr>
+      <w:r>
+        <w:rPr>
+          <w:sz w:val="20"/>
+        </w:rPr>
+        <w:t xml:space="preserve">Lifted average order value from </w:t>
+      </w:r>
+      <w:r>
+        <w:rPr>
+          <w:b/>
+          <w:sz w:val="20"/>
+        </w:rPr>
+        <w:t>€250 to €850 (3.4×)</w:t>
+      </w:r>
+      <w:r>
+        <w:rPr>
+          <w:sz w:val="20"/>
+        </w:rPr>
+        <w:t>, with marketplace conversion of ~30% versus a ~2.5% industry benchmark.</w:t>
+      </w:r>
+    </w:p>
+    <w:p>
+      <w:pPr>
+        <w:pStyle w:val="ListBullet"/>
+        <w:spacing w:before="0" w:after="20" w:line="245" w:lineRule="auto"/>
+        <w:ind w:left="317" w:hanging="216"/>
+      </w:pPr>
+      <w:r>
+        <w:rPr>
+          <w:sz w:val="20"/>
+        </w:rPr>
+        <w:t xml:space="preserve">Self-taught coding and earned multiple </w:t>
+      </w:r>
+      <w:r>
+        <w:rPr>
+          <w:b/>
+          <w:sz w:val="20"/>
+        </w:rPr>
+        <w:t>AI certifications</w:t>
+      </w:r>
+      <w:r>
+        <w:rPr>
+          <w:sz w:val="20"/>
+        </w:rPr>
+        <w:t xml:space="preserve"> (sales automation, AI-assisted presentations), applied directly to commercial workflows.</w:t>
       </w:r>
     </w:p>
     <w:p>
@@ -916,7 +1158,7 @@
         <w:rPr>
           <w:sz w:val="20"/>
         </w:rPr>
-        <w:t>Italian &amp; French (native) · English (fluent) · German (intermediate) · Japanese &amp; Hebrew (basic)</w:t>
+        <w:t>Italian &amp; French (native) · English (fluent) · German (intermediate) · Japanese (basic)</w:t>
       </w:r>
     </w:p>
     <w:p>

</xml_diff>

<commit_message>
Add modern hybrid CV (sidebar design + full substance); reorder Career Highlights (builder last, reframed off small absolute number)
Co-Authored-By: Claude Opus 4.8 <noreply@anthropic.com>
Claude-Session: https://claude.ai/code/session_01AheqiPu51AkPwVXxsTYaLv
</commit_message>
<xml_diff>
--- a/CV_Nicolas_Denna_2026_Master.docx
+++ b/CV_Nicolas_Denna_2026_Master.docx
@@ -190,33 +190,6 @@
           <w:color w:val="1F3A5F"/>
           <w:sz w:val="20"/>
         </w:rPr>
-        <w:t xml:space="preserve">Proven builder — </w:t>
-      </w:r>
-      <w:r>
-        <w:rPr>
-          <w:sz w:val="20"/>
-        </w:rPr>
-        <w:t>launched a business line from €100K to €2M (20×) and re-engineered a client portfolio from ~300 to 20 accounts to raise service and margin.</w:t>
-      </w:r>
-    </w:p>
-    <w:p>
-      <w:pPr>
-        <w:spacing w:before="20" w:after="20" w:line="252" w:lineRule="auto"/>
-        <w:ind w:left="288" w:hanging="288"/>
-      </w:pPr>
-      <w:r>
-        <w:rPr>
-          <w:color w:val="1F3A5F"/>
-          <w:sz w:val="20"/>
-        </w:rPr>
-        <w:t xml:space="preserve">▪  </w:t>
-      </w:r>
-      <w:r>
-        <w:rPr>
-          <w:b/>
-          <w:color w:val="1F3A5F"/>
-          <w:sz w:val="20"/>
-        </w:rPr>
         <w:t xml:space="preserve">Scale &amp; growth — </w:t>
       </w:r>
       <w:r>
@@ -250,7 +223,34 @@
         <w:rPr>
           <w:sz w:val="20"/>
         </w:rPr>
-        <w:t>founded a phygital B2B platform with a 3D digital-twin showroom — 27 Italian brands, ~50 agents, lifting average order value €250 → €850 (3.4×).</w:t>
+        <w:t>founded a phygital B2B platform with a 3D digital-twin showroom — 27 Italian brands, ~50 agents, 3.4× average order value.</w:t>
+      </w:r>
+    </w:p>
+    <w:p>
+      <w:pPr>
+        <w:spacing w:before="20" w:after="20" w:line="252" w:lineRule="auto"/>
+        <w:ind w:left="288" w:hanging="288"/>
+      </w:pPr>
+      <w:r>
+        <w:rPr>
+          <w:color w:val="1F3A5F"/>
+          <w:sz w:val="20"/>
+        </w:rPr>
+        <w:t xml:space="preserve">▪  </w:t>
+      </w:r>
+      <w:r>
+        <w:rPr>
+          <w:b/>
+          <w:color w:val="1F3A5F"/>
+          <w:sz w:val="20"/>
+        </w:rPr>
+        <w:t xml:space="preserve">Strategic builder — </w:t>
+      </w:r>
+      <w:r>
+        <w:rPr>
+          <w:sz w:val="20"/>
+        </w:rPr>
+        <w:t>created new business lines from scratch and re-engineered client portfolios toward a premium core (300 → 20 accounts), consistently lifting service and margin.</w:t>
       </w:r>
     </w:p>
     <w:p>

</xml_diff>